<commit_message>
chore: update documentation, ui/ux designs, and frontend components cleanup
</commit_message>
<xml_diff>
--- a/design/ASCII Wireframe.docx
+++ b/design/ASCII Wireframe.docx
@@ -2252,11 +2252,10 @@
     </w:p>
     <w:p>
       <w:r>
-        <w:rPr>
-          <w:rFonts w:ascii="Arial" w:hAnsi="Arial"/>
-          <w:sz w:val="18"/>
-        </w:rPr>
         <w:t>Dokumen ini adalah rancangan awal tampilan dan alur interaksi. ASCII wireframe dipakai agar tim bisnis, UI/UX, developer, tester, dan panitia dapat menyepakati struktur layar sebelum desain visual dan prototipe interaktif dibuat.</w:t>
+        <w:br/>
+        <w:br/>
+        <w:t>ATURAN TEMA: Tema UI/UX wajib dan tunggal adalah Techwind 3.3.0. Public Web wajib mengacu hanya pada theme-reference/HTML/Landing/dist/, sedangkan Admin Web wajib mengacu hanya pada theme-reference/HTML/Dashboard/dist/. Web dan mobile wajib mengadaptasi pola Techwind yang paling relevan. Tema, template, design system, layout, komponen visual, tipografi, dan bahasa interaksi selain Techwind dilarang. Tailwind CSS v4.x dan pustaka UI hanya berfungsi sebagai mesin atau alat implementasi; hasil visual wajib dinormalisasi ke pola dan token Techwind PORPROV.</w:t>
       </w:r>
     </w:p>
     <w:tbl>

</xml_diff>